<commit_message>
Update Milestone 1 advisor reports and add one-page summary
</commit_message>
<xml_diff>
--- a/docs/reports/GlycoLens_Milestone_1_Dataset_Audit_and_Progress_Report.docx
+++ b/docs/reports/GlycoLens_Milestone_1_Dataset_Audit_and_Progress_Report.docx
@@ -229,18 +229,8 @@
             </w:tcMar>
           </w:tcPr>
           <w:p>
-            <w:pPr>
-              <w:spacing w:after="0" w:line="252" w:lineRule="auto"/>
-              <w:jc w:val="left"/>
-            </w:pPr>
-            <w:r>
-              <w:rPr>
-                <w:rFonts w:ascii="Aptos" w:hAnsi="Aptos"/>
-                <w:b w:val="0"/>
-                <w:color w:val="000000"/>
-                <w:sz w:val="19"/>
-              </w:rPr>
-              <w:t>September 28 2026</w:t>
+            <w:r>
+              <w:t>October 1 2026</w:t>
             </w:r>
           </w:p>
         </w:tc>
@@ -256,18 +246,8 @@
             </w:tcMar>
           </w:tcPr>
           <w:p>
-            <w:pPr>
-              <w:spacing w:after="0" w:line="252" w:lineRule="auto"/>
-              <w:jc w:val="left"/>
-            </w:pPr>
-            <w:r>
-              <w:rPr>
-                <w:rFonts w:ascii="Aptos" w:hAnsi="Aptos"/>
-                <w:b w:val="0"/>
-                <w:color w:val="000000"/>
-                <w:sz w:val="19"/>
-              </w:rPr>
-              <w:t>Milestone 1 in progress</w:t>
+            <w:r>
+              <w:t>Milestone 1 complete for technical feasibility</w:t>
             </w:r>
           </w:p>
         </w:tc>
@@ -935,13 +915,14 @@
     </w:p>
     <w:p>
       <w:r>
-        <w:t>Milestone 1 is partially complete. The dataset audit and model-ready event construction are complete. The immediate closure criterion is to run persistence and Chronos-2 through a common forecasting adapter on the same held-out events and record forecast shape, quantiles, latency, memory, and failure rate.</w:t>
+        <w:t>Milestone 1 is complete as a technical-feasibility milestone. The dataset audit and model-ready event construction are complete; the common forecast adapter, persistence smoke path, pinned Chronos-2 run, synthetic FastAPI-to-Next.js flow, local Supabase contract, reproducible py-mgipsim scenario, and milestone presentation have also been implemented and validated. Full accuracy benchmarking remains Milestone 2 work.</w:t>
       </w:r>
     </w:p>
     <w:p>
       <w:pPr>
         <w:pStyle w:val="Heading1"/>
         <w:keepNext/>
+        <w:pageBreakBefore/>
       </w:pPr>
       <w:r>
         <w:t>Dataset Identity and Provenance</w:t>
@@ -8995,17 +8976,7 @@
             </w:tcMar>
           </w:tcPr>
           <w:p>
-            <w:pPr>
-              <w:spacing w:after="0" w:line="252" w:lineRule="auto"/>
-              <w:jc w:val="left"/>
-            </w:pPr>
-            <w:r>
-              <w:rPr>
-                <w:rFonts w:ascii="Aptos" w:hAnsi="Aptos"/>
-                <w:b w:val="0"/>
-                <w:color w:val="000000"/>
-                <w:sz w:val="19"/>
-              </w:rPr>
+            <w:r>
               <w:t>Literature survey and model matrix</w:t>
             </w:r>
           </w:p>
@@ -9022,17 +8993,7 @@
             </w:tcMar>
           </w:tcPr>
           <w:p>
-            <w:pPr>
-              <w:spacing w:after="0" w:line="252" w:lineRule="auto"/>
-              <w:jc w:val="left"/>
-            </w:pPr>
-            <w:r>
-              <w:rPr>
-                <w:rFonts w:ascii="Aptos" w:hAnsi="Aptos"/>
-                <w:b w:val="0"/>
-                <w:color w:val="000000"/>
-                <w:sz w:val="19"/>
-              </w:rPr>
+            <w:r>
               <w:t>Complete</w:t>
             </w:r>
           </w:p>
@@ -9049,18 +9010,8 @@
             </w:tcMar>
           </w:tcPr>
           <w:p>
-            <w:pPr>
-              <w:spacing w:after="0" w:line="252" w:lineRule="auto"/>
-              <w:jc w:val="left"/>
-            </w:pPr>
-            <w:r>
-              <w:rPr>
-                <w:rFonts w:ascii="Aptos" w:hAnsi="Aptos"/>
-                <w:b w:val="0"/>
-                <w:color w:val="000000"/>
-                <w:sz w:val="19"/>
-              </w:rPr>
-              <w:t>Planning pack defines required and exploratory candidates</w:t>
+            <w:r>
+              <w:t>Planning pack defines candidate roles, evidence, risks, and selection criteria</w:t>
             </w:r>
           </w:p>
         </w:tc>
@@ -9079,17 +9030,7 @@
             <w:shd w:fill="F5F8FC"/>
           </w:tcPr>
           <w:p>
-            <w:pPr>
-              <w:spacing w:after="0" w:line="252" w:lineRule="auto"/>
-              <w:jc w:val="left"/>
-            </w:pPr>
-            <w:r>
-              <w:rPr>
-                <w:rFonts w:ascii="Aptos" w:hAnsi="Aptos"/>
-                <w:b w:val="0"/>
-                <w:color w:val="000000"/>
-                <w:sz w:val="19"/>
-              </w:rPr>
+            <w:r>
               <w:t>T1D-UOM provenance and dataset audit</w:t>
             </w:r>
           </w:p>
@@ -9107,17 +9048,7 @@
             <w:shd w:fill="F5F8FC"/>
           </w:tcPr>
           <w:p>
-            <w:pPr>
-              <w:spacing w:after="0" w:line="252" w:lineRule="auto"/>
-              <w:jc w:val="left"/>
-            </w:pPr>
-            <w:r>
-              <w:rPr>
-                <w:rFonts w:ascii="Aptos" w:hAnsi="Aptos"/>
-                <w:b w:val="0"/>
-                <w:color w:val="000000"/>
-                <w:sz w:val="19"/>
-              </w:rPr>
+            <w:r>
               <w:t>Complete</w:t>
             </w:r>
           </w:p>
@@ -9135,17 +9066,7 @@
             <w:shd w:fill="F5F8FC"/>
           </w:tcPr>
           <w:p>
-            <w:pPr>
-              <w:spacing w:after="0" w:line="252" w:lineRule="auto"/>
-              <w:jc w:val="left"/>
-            </w:pPr>
-            <w:r>
-              <w:rPr>
-                <w:rFonts w:ascii="Aptos" w:hAnsi="Aptos"/>
-                <w:b w:val="0"/>
-                <w:color w:val="000000"/>
-                <w:sz w:val="19"/>
-              </w:rPr>
+            <w:r>
               <w:t>V1.0.4 pin and quantified audit</w:t>
             </w:r>
           </w:p>
@@ -9164,17 +9085,7 @@
             </w:tcMar>
           </w:tcPr>
           <w:p>
-            <w:pPr>
-              <w:spacing w:after="0" w:line="252" w:lineRule="auto"/>
-              <w:jc w:val="left"/>
-            </w:pPr>
-            <w:r>
-              <w:rPr>
-                <w:rFonts w:ascii="Aptos" w:hAnsi="Aptos"/>
-                <w:b w:val="0"/>
-                <w:color w:val="000000"/>
-                <w:sz w:val="19"/>
-              </w:rPr>
+            <w:r>
               <w:t>Meal-centered preprocessing</w:t>
             </w:r>
           </w:p>
@@ -9191,18 +9102,8 @@
             </w:tcMar>
           </w:tcPr>
           <w:p>
-            <w:pPr>
-              <w:spacing w:after="0" w:line="252" w:lineRule="auto"/>
-              <w:jc w:val="left"/>
-            </w:pPr>
-            <w:r>
-              <w:rPr>
-                <w:rFonts w:ascii="Aptos" w:hAnsi="Aptos"/>
-                <w:b w:val="0"/>
-                <w:color w:val="000000"/>
-                <w:sz w:val="19"/>
-              </w:rPr>
-              <w:t>Complete</w:t>
+            <w:r>
+              <w:t>Complete for M1</w:t>
             </w:r>
           </w:p>
         </w:tc>
@@ -9218,17 +9119,7 @@
             </w:tcMar>
           </w:tcPr>
           <w:p>
-            <w:pPr>
-              <w:spacing w:after="0" w:line="252" w:lineRule="auto"/>
-              <w:jc w:val="left"/>
-            </w:pPr>
-            <w:r>
-              <w:rPr>
-                <w:rFonts w:ascii="Aptos" w:hAnsi="Aptos"/>
-                <w:b w:val="0"/>
-                <w:color w:val="000000"/>
-                <w:sz w:val="19"/>
-              </w:rPr>
+            <w:r>
               <w:t>927 strict model-ready windows</w:t>
             </w:r>
           </w:p>
@@ -9248,17 +9139,7 @@
             <w:shd w:fill="F5F8FC"/>
           </w:tcPr>
           <w:p>
-            <w:pPr>
-              <w:spacing w:after="0" w:line="252" w:lineRule="auto"/>
-              <w:jc w:val="left"/>
-            </w:pPr>
-            <w:r>
-              <w:rPr>
-                <w:rFonts w:ascii="Aptos" w:hAnsi="Aptos"/>
-                <w:b w:val="0"/>
-                <w:color w:val="000000"/>
-                <w:sz w:val="19"/>
-              </w:rPr>
+            <w:r>
               <w:t>Evaluation and leakage protocol</w:t>
             </w:r>
           </w:p>
@@ -9276,18 +9157,8 @@
             <w:shd w:fill="F5F8FC"/>
           </w:tcPr>
           <w:p>
-            <w:pPr>
-              <w:spacing w:after="0" w:line="252" w:lineRule="auto"/>
-              <w:jc w:val="left"/>
-            </w:pPr>
-            <w:r>
-              <w:rPr>
-                <w:rFonts w:ascii="Aptos" w:hAnsi="Aptos"/>
-                <w:b w:val="0"/>
-                <w:color w:val="000000"/>
-                <w:sz w:val="19"/>
-              </w:rPr>
-              <w:t>Complete for initial slice</w:t>
+            <w:r>
+              <w:t>Complete for M1</w:t>
             </w:r>
           </w:p>
         </w:tc>
@@ -9304,18 +9175,8 @@
             <w:shd w:fill="F5F8FC"/>
           </w:tcPr>
           <w:p>
-            <w:pPr>
-              <w:spacing w:after="0" w:line="252" w:lineRule="auto"/>
-              <w:jc w:val="left"/>
-            </w:pPr>
-            <w:r>
-              <w:rPr>
-                <w:rFonts w:ascii="Aptos" w:hAnsi="Aptos"/>
-                <w:b w:val="0"/>
-                <w:color w:val="000000"/>
-                <w:sz w:val="19"/>
-              </w:rPr>
-              <w:t>Needs final split freeze and sensitivity analysis</w:t>
+            <w:r>
+              <w:t>Structural leakage controls pass; final split freeze and sensitivity analysis move to M2</w:t>
             </w:r>
           </w:p>
         </w:tc>
@@ -9333,17 +9194,7 @@
             </w:tcMar>
           </w:tcPr>
           <w:p>
-            <w:pPr>
-              <w:spacing w:after="0" w:line="252" w:lineRule="auto"/>
-              <w:jc w:val="left"/>
-            </w:pPr>
-            <w:r>
-              <w:rPr>
-                <w:rFonts w:ascii="Aptos" w:hAnsi="Aptos"/>
-                <w:b w:val="0"/>
-                <w:color w:val="000000"/>
-                <w:sz w:val="19"/>
-              </w:rPr>
+            <w:r>
               <w:t>Common forecast adapter</w:t>
             </w:r>
           </w:p>
@@ -9360,18 +9211,8 @@
             </w:tcMar>
           </w:tcPr>
           <w:p>
-            <w:pPr>
-              <w:spacing w:after="0" w:line="252" w:lineRule="auto"/>
-              <w:jc w:val="left"/>
-            </w:pPr>
-            <w:r>
-              <w:rPr>
-                <w:rFonts w:ascii="Aptos" w:hAnsi="Aptos"/>
-                <w:b w:val="0"/>
-                <w:color w:val="000000"/>
-                <w:sz w:val="19"/>
-              </w:rPr>
-              <w:t>Not started</w:t>
+            <w:r>
+              <w:t>Complete</w:t>
             </w:r>
           </w:p>
         </w:tc>
@@ -9387,18 +9228,8 @@
             </w:tcMar>
           </w:tcPr>
           <w:p>
-            <w:pPr>
-              <w:spacing w:after="0" w:line="252" w:lineRule="auto"/>
-              <w:jc w:val="left"/>
-            </w:pPr>
-            <w:r>
-              <w:rPr>
-                <w:rFonts w:ascii="Aptos" w:hAnsi="Aptos"/>
-                <w:b w:val="0"/>
-                <w:color w:val="000000"/>
-                <w:sz w:val="19"/>
-              </w:rPr>
-              <w:t>Define one contract for persistence and pretrained models</w:t>
+            <w:r>
+              <w:t>Immutable request/result contract separates held-out future truth</w:t>
             </w:r>
           </w:p>
         </w:tc>
@@ -9417,17 +9248,7 @@
             <w:shd w:fill="F5F8FC"/>
           </w:tcPr>
           <w:p>
-            <w:pPr>
-              <w:spacing w:after="0" w:line="252" w:lineRule="auto"/>
-              <w:jc w:val="left"/>
-            </w:pPr>
-            <w:r>
-              <w:rPr>
-                <w:rFonts w:ascii="Aptos" w:hAnsi="Aptos"/>
-                <w:b w:val="0"/>
-                <w:color w:val="000000"/>
-                <w:sz w:val="19"/>
-              </w:rPr>
+            <w:r>
               <w:t>Persistence baseline pipeline</w:t>
             </w:r>
           </w:p>
@@ -9445,18 +9266,8 @@
             <w:shd w:fill="F5F8FC"/>
           </w:tcPr>
           <w:p>
-            <w:pPr>
-              <w:spacing w:after="0" w:line="252" w:lineRule="auto"/>
-              <w:jc w:val="left"/>
-            </w:pPr>
-            <w:r>
-              <w:rPr>
-                <w:rFonts w:ascii="Aptos" w:hAnsi="Aptos"/>
-                <w:b w:val="0"/>
-                <w:color w:val="000000"/>
-                <w:sz w:val="19"/>
-              </w:rPr>
-              <w:t>Partial</w:t>
+            <w:r>
+              <w:t>Complete for M1</w:t>
             </w:r>
           </w:p>
         </w:tc>
@@ -9473,18 +9284,8 @@
             <w:shd w:fill="F5F8FC"/>
           </w:tcPr>
           <w:p>
-            <w:pPr>
-              <w:spacing w:after="0" w:line="252" w:lineRule="auto"/>
-              <w:jc w:val="left"/>
-            </w:pPr>
-            <w:r>
-              <w:rPr>
-                <w:rFonts w:ascii="Aptos" w:hAnsi="Aptos"/>
-                <w:b w:val="0"/>
-                <w:color w:val="000000"/>
-                <w:sz w:val="19"/>
-              </w:rPr>
-              <w:t>Descriptive metrics calculated; held-out runner still needed</w:t>
+            <w:r>
+              <w:t>Real-window smoke path works; participant-aware benchmark moves to M2</w:t>
             </w:r>
           </w:p>
         </w:tc>
@@ -9502,17 +9303,7 @@
             </w:tcMar>
           </w:tcPr>
           <w:p>
-            <w:pPr>
-              <w:spacing w:after="0" w:line="252" w:lineRule="auto"/>
-              <w:jc w:val="left"/>
-            </w:pPr>
-            <w:r>
-              <w:rPr>
-                <w:rFonts w:ascii="Aptos" w:hAnsi="Aptos"/>
-                <w:b w:val="0"/>
-                <w:color w:val="000000"/>
-                <w:sz w:val="19"/>
-              </w:rPr>
+            <w:r>
               <w:t>Chronos-2 smoke test</w:t>
             </w:r>
           </w:p>
@@ -9529,18 +9320,8 @@
             </w:tcMar>
           </w:tcPr>
           <w:p>
-            <w:pPr>
-              <w:spacing w:after="0" w:line="252" w:lineRule="auto"/>
-              <w:jc w:val="left"/>
-            </w:pPr>
-            <w:r>
-              <w:rPr>
-                <w:rFonts w:ascii="Aptos" w:hAnsi="Aptos"/>
-                <w:b w:val="0"/>
-                <w:color w:val="000000"/>
-                <w:sz w:val="19"/>
-              </w:rPr>
-              <w:t>Not started</w:t>
+            <w:r>
+              <w:t>Complete</w:t>
             </w:r>
           </w:p>
         </w:tc>
@@ -9556,18 +9337,8 @@
             </w:tcMar>
           </w:tcPr>
           <w:p>
-            <w:pPr>
-              <w:spacing w:after="0" w:line="252" w:lineRule="auto"/>
-              <w:jc w:val="left"/>
-            </w:pPr>
-            <w:r>
-              <w:rPr>
-                <w:rFonts w:ascii="Aptos" w:hAnsi="Aptos"/>
-                <w:b w:val="0"/>
-                <w:color w:val="000000"/>
-                <w:sz w:val="19"/>
-              </w:rPr>
-              <w:t>Primary M1 closure criterion</w:t>
+            <w:r>
+              <w:t>Pinned CPU checkpoint returned 24 finite q10/q50/q90 points</w:t>
             </w:r>
           </w:p>
         </w:tc>
@@ -9586,17 +9357,7 @@
             <w:shd w:fill="F5F8FC"/>
           </w:tcPr>
           <w:p>
-            <w:pPr>
-              <w:spacing w:after="0" w:line="252" w:lineRule="auto"/>
-              <w:jc w:val="left"/>
-            </w:pPr>
-            <w:r>
-              <w:rPr>
-                <w:rFonts w:ascii="Aptos" w:hAnsi="Aptos"/>
-                <w:b w:val="0"/>
-                <w:color w:val="000000"/>
-                <w:sz w:val="19"/>
-              </w:rPr>
+            <w:r>
               <w:t>TimesFM smoke test</w:t>
             </w:r>
           </w:p>
@@ -9614,18 +9375,8 @@
             <w:shd w:fill="F5F8FC"/>
           </w:tcPr>
           <w:p>
-            <w:pPr>
-              <w:spacing w:after="0" w:line="252" w:lineRule="auto"/>
-              <w:jc w:val="left"/>
-            </w:pPr>
-            <w:r>
-              <w:rPr>
-                <w:rFonts w:ascii="Aptos" w:hAnsi="Aptos"/>
-                <w:b w:val="0"/>
-                <w:color w:val="000000"/>
-                <w:sz w:val="19"/>
-              </w:rPr>
-              <w:t>Not started</w:t>
+            <w:r>
+              <w:t>Not completed; non-blocking</w:t>
             </w:r>
           </w:p>
         </w:tc>
@@ -9642,18 +9393,8 @@
             <w:shd w:fill="F5F8FC"/>
           </w:tcPr>
           <w:p>
-            <w:pPr>
-              <w:spacing w:after="0" w:line="252" w:lineRule="auto"/>
-              <w:jc w:val="left"/>
-            </w:pPr>
-            <w:r>
-              <w:rPr>
-                <w:rFonts w:ascii="Aptos" w:hAnsi="Aptos"/>
-                <w:b w:val="0"/>
-                <w:color w:val="000000"/>
-                <w:sz w:val="19"/>
-              </w:rPr>
-              <w:t>Attempt after Chronos-2 if time permits</w:t>
+            <w:r>
+              <w:t>Optional for M1; decide M2 requirement with advisor</w:t>
             </w:r>
           </w:p>
         </w:tc>
@@ -9671,17 +9412,7 @@
             </w:tcMar>
           </w:tcPr>
           <w:p>
-            <w:pPr>
-              <w:spacing w:after="0" w:line="252" w:lineRule="auto"/>
-              <w:jc w:val="left"/>
-            </w:pPr>
-            <w:r>
-              <w:rPr>
-                <w:rFonts w:ascii="Aptos" w:hAnsi="Aptos"/>
-                <w:b w:val="0"/>
-                <w:color w:val="000000"/>
-                <w:sz w:val="19"/>
-              </w:rPr>
+            <w:r>
               <w:t>Runtime memory and quantile evidence</w:t>
             </w:r>
           </w:p>
@@ -9698,18 +9429,8 @@
             </w:tcMar>
           </w:tcPr>
           <w:p>
-            <w:pPr>
-              <w:spacing w:after="0" w:line="252" w:lineRule="auto"/>
-              <w:jc w:val="left"/>
-            </w:pPr>
-            <w:r>
-              <w:rPr>
-                <w:rFonts w:ascii="Aptos" w:hAnsi="Aptos"/>
-                <w:b w:val="0"/>
-                <w:color w:val="000000"/>
-                <w:sz w:val="19"/>
-              </w:rPr>
-              <w:t>Not started</w:t>
+            <w:r>
+              <w:t>Complete</w:t>
             </w:r>
           </w:p>
         </w:tc>
@@ -9725,18 +9446,8 @@
             </w:tcMar>
           </w:tcPr>
           <w:p>
-            <w:pPr>
-              <w:spacing w:after="0" w:line="252" w:lineRule="auto"/>
-              <w:jc w:val="left"/>
-            </w:pPr>
-            <w:r>
-              <w:rPr>
-                <w:rFonts w:ascii="Aptos" w:hAnsi="Aptos"/>
-                <w:b w:val="0"/>
-                <w:color w:val="000000"/>
-                <w:sz w:val="19"/>
-              </w:rPr>
-              <w:t>Capture during model smoke tests</w:t>
+            <w:r>
+              <w:t>Load, first/warm latency, peak RSS, shape, and quantile ordering recorded</w:t>
             </w:r>
           </w:p>
         </w:tc>
@@ -9755,17 +9466,7 @@
             <w:shd w:fill="F5F8FC"/>
           </w:tcPr>
           <w:p>
-            <w:pPr>
-              <w:spacing w:after="0" w:line="252" w:lineRule="auto"/>
-              <w:jc w:val="left"/>
-            </w:pPr>
-            <w:r>
-              <w:rPr>
-                <w:rFonts w:ascii="Aptos" w:hAnsi="Aptos"/>
-                <w:b w:val="0"/>
-                <w:color w:val="000000"/>
-                <w:sz w:val="19"/>
-              </w:rPr>
+            <w:r>
               <w:t>Next.js and FastAPI skeleton</w:t>
             </w:r>
           </w:p>
@@ -9783,18 +9484,8 @@
             <w:shd w:fill="F5F8FC"/>
           </w:tcPr>
           <w:p>
-            <w:pPr>
-              <w:spacing w:after="0" w:line="252" w:lineRule="auto"/>
-              <w:jc w:val="left"/>
-            </w:pPr>
-            <w:r>
-              <w:rPr>
-                <w:rFonts w:ascii="Aptos" w:hAnsi="Aptos"/>
-                <w:b w:val="0"/>
-                <w:color w:val="000000"/>
-                <w:sz w:val="19"/>
-              </w:rPr>
-              <w:t>Not started</w:t>
+            <w:r>
+              <w:t>Complete for M1</w:t>
             </w:r>
           </w:p>
         </w:tc>
@@ -9811,18 +9502,8 @@
             <w:shd w:fill="F5F8FC"/>
           </w:tcPr>
           <w:p>
-            <w:pPr>
-              <w:spacing w:after="0" w:line="252" w:lineRule="auto"/>
-              <w:jc w:val="left"/>
-            </w:pPr>
-            <w:r>
-              <w:rPr>
-                <w:rFonts w:ascii="Aptos" w:hAnsi="Aptos"/>
-                <w:b w:val="0"/>
-                <w:color w:val="000000"/>
-                <w:sz w:val="19"/>
-              </w:rPr>
-              <w:t>One dummy end-to-end request required</w:t>
+            <w:r>
+              <w:t>Typed synthetic browser-to-API forecast flow; real model request path remains M2</w:t>
             </w:r>
           </w:p>
         </w:tc>
@@ -9840,17 +9521,7 @@
             </w:tcMar>
           </w:tcPr>
           <w:p>
-            <w:pPr>
-              <w:spacing w:after="0" w:line="252" w:lineRule="auto"/>
-              <w:jc w:val="left"/>
-            </w:pPr>
-            <w:r>
-              <w:rPr>
-                <w:rFonts w:ascii="Aptos" w:hAnsi="Aptos"/>
-                <w:b w:val="0"/>
-                <w:color w:val="000000"/>
-                <w:sz w:val="19"/>
-              </w:rPr>
+            <w:r>
               <w:t>Database migration</w:t>
             </w:r>
           </w:p>
@@ -9867,18 +9538,8 @@
             </w:tcMar>
           </w:tcPr>
           <w:p>
-            <w:pPr>
-              <w:spacing w:after="0" w:line="252" w:lineRule="auto"/>
-              <w:jc w:val="left"/>
-            </w:pPr>
-            <w:r>
-              <w:rPr>
-                <w:rFonts w:ascii="Aptos" w:hAnsi="Aptos"/>
-                <w:b w:val="0"/>
-                <w:color w:val="000000"/>
-                <w:sz w:val="19"/>
-              </w:rPr>
-              <w:t>Not started</w:t>
+            <w:r>
+              <w:t>Complete locally</w:t>
             </w:r>
           </w:p>
         </w:tc>
@@ -9894,18 +9555,8 @@
             </w:tcMar>
           </w:tcPr>
           <w:p>
-            <w:pPr>
-              <w:spacing w:after="0" w:line="252" w:lineRule="auto"/>
-              <w:jc w:val="left"/>
-            </w:pPr>
-            <w:r>
-              <w:rPr>
-                <w:rFonts w:ascii="Aptos" w:hAnsi="Aptos"/>
-                <w:b w:val="0"/>
-                <w:color w:val="000000"/>
-                <w:sz w:val="19"/>
-              </w:rPr>
-              <w:t>Implement documented schema</w:t>
+            <w:r>
+              <w:t>Ten tables, pgvector, constraints, RLS, and 20 pgTAP tests; no hosted project linked</w:t>
             </w:r>
           </w:p>
         </w:tc>
@@ -9924,17 +9575,7 @@
             <w:shd w:fill="F5F8FC"/>
           </w:tcPr>
           <w:p>
-            <w:pPr>
-              <w:spacing w:after="0" w:line="252" w:lineRule="auto"/>
-              <w:jc w:val="left"/>
-            </w:pPr>
-            <w:r>
-              <w:rPr>
-                <w:rFonts w:ascii="Aptos" w:hAnsi="Aptos"/>
-                <w:b w:val="0"/>
-                <w:color w:val="000000"/>
-                <w:sz w:val="19"/>
-              </w:rPr>
+            <w:r>
               <w:t>py-mgipsim scenario</w:t>
             </w:r>
           </w:p>
@@ -9952,18 +9593,8 @@
             <w:shd w:fill="F5F8FC"/>
           </w:tcPr>
           <w:p>
-            <w:pPr>
-              <w:spacing w:after="0" w:line="252" w:lineRule="auto"/>
-              <w:jc w:val="left"/>
-            </w:pPr>
-            <w:r>
-              <w:rPr>
-                <w:rFonts w:ascii="Aptos" w:hAnsi="Aptos"/>
-                <w:b w:val="0"/>
-                <w:color w:val="000000"/>
-                <w:sz w:val="19"/>
-              </w:rPr>
-              <w:t>Not started</w:t>
+            <w:r>
+              <w:t>Complete</w:t>
             </w:r>
           </w:p>
         </w:tc>
@@ -9980,18 +9611,8 @@
             <w:shd w:fill="F5F8FC"/>
           </w:tcPr>
           <w:p>
-            <w:pPr>
-              <w:spacing w:after="0" w:line="252" w:lineRule="auto"/>
-              <w:jc w:val="left"/>
-            </w:pPr>
-            <w:r>
-              <w:rPr>
-                <w:rFonts w:ascii="Aptos" w:hAnsi="Aptos"/>
-                <w:b w:val="0"/>
-                <w:color w:val="000000"/>
-                <w:sz w:val="19"/>
-              </w:rPr>
-              <w:t>Run one reproducible virtual scenario</w:t>
+            <w:r>
+              <w:t>Pinned ExtHovorka/OpenLoop day reproduced byte-for-byte with 288 samples</w:t>
             </w:r>
           </w:p>
         </w:tc>
@@ -10009,17 +9630,7 @@
             </w:tcMar>
           </w:tcPr>
           <w:p>
-            <w:pPr>
-              <w:spacing w:after="0" w:line="252" w:lineRule="auto"/>
-              <w:jc w:val="left"/>
-            </w:pPr>
-            <w:r>
-              <w:rPr>
-                <w:rFonts w:ascii="Aptos" w:hAnsi="Aptos"/>
-                <w:b w:val="0"/>
-                <w:color w:val="000000"/>
-                <w:sz w:val="19"/>
-              </w:rPr>
+            <w:r>
               <w:t>Milestone presentation artifact</w:t>
             </w:r>
           </w:p>
@@ -10036,18 +9647,8 @@
             </w:tcMar>
           </w:tcPr>
           <w:p>
-            <w:pPr>
-              <w:spacing w:after="0" w:line="252" w:lineRule="auto"/>
-              <w:jc w:val="left"/>
-            </w:pPr>
-            <w:r>
-              <w:rPr>
-                <w:rFonts w:ascii="Aptos" w:hAnsi="Aptos"/>
-                <w:b w:val="0"/>
-                <w:color w:val="000000"/>
-                <w:sz w:val="19"/>
-              </w:rPr>
-              <w:t>Not started</w:t>
+            <w:r>
+              <w:t>Complete</w:t>
             </w:r>
           </w:p>
         </w:tc>
@@ -10063,18 +9664,8 @@
             </w:tcMar>
           </w:tcPr>
           <w:p>
-            <w:pPr>
-              <w:spacing w:after="0" w:line="252" w:lineRule="auto"/>
-              <w:jc w:val="left"/>
-            </w:pPr>
-            <w:r>
-              <w:rPr>
-                <w:rFonts w:ascii="Aptos" w:hAnsi="Aptos"/>
-                <w:b w:val="0"/>
-                <w:color w:val="000000"/>
-                <w:sz w:val="19"/>
-              </w:rPr>
-              <w:t>Prepare concise advisor and course update</w:t>
+            <w:r>
+              <w:t>Seven-slide editable RIT deck validated</w:t>
             </w:r>
           </w:p>
         </w:tc>
@@ -10831,18 +10422,8 @@
             <w:shd w:fill="F5F8FC"/>
           </w:tcPr>
           <w:p>
-            <w:pPr>
-              <w:spacing w:after="0" w:line="252" w:lineRule="auto"/>
-              <w:jc w:val="left"/>
-            </w:pPr>
-            <w:r>
-              <w:rPr>
-                <w:rFonts w:ascii="Aptos" w:hAnsi="Aptos"/>
-                <w:b w:val="0"/>
-                <w:color w:val="000000"/>
-                <w:sz w:val="19"/>
-              </w:rPr>
-              <w:t>No pretrained result yet</w:t>
+            <w:r>
+              <w:t>No full model benchmark yet</w:t>
             </w:r>
           </w:p>
         </w:tc>
@@ -10859,18 +10440,8 @@
             <w:shd w:fill="F5F8FC"/>
           </w:tcPr>
           <w:p>
-            <w:pPr>
-              <w:spacing w:after="0" w:line="252" w:lineRule="auto"/>
-              <w:jc w:val="left"/>
-            </w:pPr>
-            <w:r>
-              <w:rPr>
-                <w:rFonts w:ascii="Aptos" w:hAnsi="Aptos"/>
-                <w:b w:val="0"/>
-                <w:color w:val="000000"/>
-                <w:sz w:val="19"/>
-              </w:rPr>
-              <w:t>Only persistence is quantified</w:t>
+            <w:r>
+              <w:t>Chronos-2 feasibility is complete on one eligible window</w:t>
             </w:r>
           </w:p>
         </w:tc>
@@ -10887,18 +10458,8 @@
             <w:shd w:fill="F5F8FC"/>
           </w:tcPr>
           <w:p>
-            <w:pPr>
-              <w:spacing w:after="0" w:line="252" w:lineRule="auto"/>
-              <w:jc w:val="left"/>
-            </w:pPr>
-            <w:r>
-              <w:rPr>
-                <w:rFonts w:ascii="Aptos" w:hAnsi="Aptos"/>
-                <w:b w:val="0"/>
-                <w:color w:val="000000"/>
-                <w:sz w:val="19"/>
-              </w:rPr>
-              <w:t>Run Chronos-2 before claiming model feasibility</w:t>
+            <w:r>
+              <w:t>Run the participant-aware persistence-versus-Chronos benchmark in M2</w:t>
             </w:r>
           </w:p>
         </w:tc>
@@ -10996,9 +10557,10 @@
       <w:pPr>
         <w:pStyle w:val="Heading1"/>
         <w:keepNext/>
+        <w:pageBreakBefore/>
       </w:pPr>
       <w:r>
-        <w:t>Recommended Next Steps</w:t>
+        <w:t>Milestone 2 Priorities</w:t>
       </w:r>
     </w:p>
     <w:p>
@@ -11006,7 +10568,7 @@
         <w:pStyle w:val="ListNumber"/>
       </w:pPr>
       <w:r>
-        <w:t>Freeze the evaluation protocol. Define the chronological per-participant split, the shared event identifiers, and the complete-case subset used for context-length comparisons. The simple 60 20 20 allocation yields 551 training or retrieval events, 180 validation events, and 196 test events, but low-volume participants require an explicit minimum-count rule.</w:t>
+        <w:t>Freeze the participant-aware train, validation, and test definitions and record the shared event identifiers used by every model.</w:t>
       </w:r>
     </w:p>
     <w:p>
@@ -11014,7 +10576,7 @@
         <w:pStyle w:val="ListNumber"/>
       </w:pPr>
       <w:r>
-        <w:t>Implement the common ForecastModelAdapter and a reproducible persistence runner. Make forecast values, quantiles, model metadata, load time, inference time, memory, and failure status part of the contract.</w:t>
+        <w:t>Benchmark persistence and Chronos-2 on the same held-out events using MAE, RMSE, horizon-specific error, probabilistic metrics, latency, memory, and failed-run rate.</w:t>
       </w:r>
     </w:p>
     <w:p>
@@ -11022,7 +10584,7 @@
         <w:pStyle w:val="ListNumber"/>
       </w:pPr>
       <w:r>
-        <w:t>Run a Chronos-2 smoke test first. Start with a small deterministic sample, verify 24-step output and quantiles, then run the frozen model on the same held-out events as persistence. Record p50 and p95 latency, peak memory, and failed runs.</w:t>
+        <w:t>Run the planned context comparisons for CGM only, CGM plus insulin, and CGM plus insulin and nutrition.</w:t>
       </w:r>
     </w:p>
     <w:p>
@@ -11030,7 +10592,7 @@
         <w:pStyle w:val="ListNumber"/>
       </w:pPr>
       <w:r>
-        <w:t>Compare Chronos-2 with persistence before adding more models. If the adapter and metrics are stable, add TimesFM as the second required candidate; keep CGMformer exploratory.</w:t>
+        <w:t>Implement meal and nutrition capture with provenance and connect the validated meal object to the forecast request.</w:t>
       </w:r>
     </w:p>
     <w:p>
@@ -11038,7 +10600,7 @@
         <w:pStyle w:val="ListNumber"/>
       </w:pPr>
       <w:r>
-        <w:t>Normalize insulin and meal covariates before the context ablation. Resolve basal-dose units by insulin kind and define controlled meal-label categories while retaining raw values outside model inputs.</w:t>
+        <w:t>Connect real research-model output to the application boundary without copying research rows into the application database.</w:t>
       </w:r>
     </w:p>
     <w:p>
@@ -11046,7 +10608,7 @@
         <w:pStyle w:val="ListNumber"/>
       </w:pPr>
       <w:r>
-        <w:t>Create the minimum end-to-end application path. Add the FastAPI and Next.js skeletons, implement one dummy forecast request, and apply an executable database migration that matches the documented schema.</w:t>
+        <w:t>Persist forecasts and implement the first owner-isolated similar-meal retrieval path.</w:t>
       </w:r>
     </w:p>
     <w:p>
@@ -11054,7 +10616,7 @@
         <w:pStyle w:val="ListNumber"/>
       </w:pPr>
       <w:r>
-        <w:t>Run one py-mgipsim scenario and capture the reproducible configuration. Use simulation for integration and demonstration, not as real-patient validation.</w:t>
+        <w:t>Decide with the advisor whether TimesFM is required for Milestone 2 or remains optional.</w:t>
       </w:r>
     </w:p>
     <w:p>
@@ -11062,7 +10624,7 @@
         <w:pStyle w:val="ListNumber"/>
       </w:pPr>
       <w:r>
-        <w:t>After the core experiment is stable, add shared-feature external validation with AZT1D or HUPA-UCM and prepare the Milestone 1 presentation around completed evidence, open risks, and advisor decisions.</w:t>
+        <w:t>Retain the research-only, uncertainty, privacy, and no-dosing boundaries in all demonstrations and evaluation reports.</w:t>
       </w:r>
     </w:p>
     <w:p>
@@ -11071,7 +10633,7 @@
         <w:keepNext/>
       </w:pPr>
       <w:r>
-        <w:t>Immediate Execution Plan</w:t>
+        <w:t>Milestone 2 Immediate Plan</w:t>
       </w:r>
     </w:p>
     <w:tbl>
@@ -11196,17 +10758,7 @@
             </w:tcMar>
           </w:tcPr>
           <w:p>
-            <w:pPr>
-              <w:spacing w:after="0" w:line="252" w:lineRule="auto"/>
-              <w:jc w:val="center"/>
-            </w:pPr>
-            <w:r>
-              <w:rPr>
-                <w:rFonts w:ascii="Aptos" w:hAnsi="Aptos"/>
-                <w:b w:val="0"/>
-                <w:color w:val="000000"/>
-                <w:sz w:val="19"/>
-              </w:rPr>
+            <w:r>
               <w:t>1</w:t>
             </w:r>
           </w:p>
@@ -11223,18 +10775,8 @@
             </w:tcMar>
           </w:tcPr>
           <w:p>
-            <w:pPr>
-              <w:spacing w:after="0" w:line="252" w:lineRule="auto"/>
-              <w:jc w:val="left"/>
-            </w:pPr>
-            <w:r>
-              <w:rPr>
-                <w:rFonts w:ascii="Aptos" w:hAnsi="Aptos"/>
-                <w:b w:val="0"/>
-                <w:color w:val="000000"/>
-                <w:sz w:val="19"/>
-              </w:rPr>
-              <w:t>Evaluation split manifest</w:t>
+            <w:r>
+              <w:t>Participant-aware split manifest</w:t>
             </w:r>
           </w:p>
         </w:tc>
@@ -11250,18 +10792,8 @@
             </w:tcMar>
           </w:tcPr>
           <w:p>
-            <w:pPr>
-              <w:spacing w:after="0" w:line="252" w:lineRule="auto"/>
-              <w:jc w:val="left"/>
-            </w:pPr>
-            <w:r>
-              <w:rPr>
-                <w:rFonts w:ascii="Aptos" w:hAnsi="Aptos"/>
-                <w:b w:val="0"/>
-                <w:color w:val="000000"/>
-                <w:sz w:val="19"/>
-              </w:rPr>
-              <w:t>No future leakage and non-empty test allocation under the chosen participant rule</w:t>
+            <w:r>
+              <w:t>No future leakage and reproducible train, validation, and test cohorts</w:t>
             </w:r>
           </w:p>
         </w:tc>
@@ -11280,17 +10812,7 @@
             <w:shd w:fill="F5F8FC"/>
           </w:tcPr>
           <w:p>
-            <w:pPr>
-              <w:spacing w:after="0" w:line="252" w:lineRule="auto"/>
-              <w:jc w:val="center"/>
-            </w:pPr>
-            <w:r>
-              <w:rPr>
-                <w:rFonts w:ascii="Aptos" w:hAnsi="Aptos"/>
-                <w:b w:val="0"/>
-                <w:color w:val="000000"/>
-                <w:sz w:val="19"/>
-              </w:rPr>
+            <w:r>
               <w:t>2</w:t>
             </w:r>
           </w:p>
@@ -11308,18 +10830,8 @@
             <w:shd w:fill="F5F8FC"/>
           </w:tcPr>
           <w:p>
-            <w:pPr>
-              <w:spacing w:after="0" w:line="252" w:lineRule="auto"/>
-              <w:jc w:val="left"/>
-            </w:pPr>
-            <w:r>
-              <w:rPr>
-                <w:rFonts w:ascii="Aptos" w:hAnsi="Aptos"/>
-                <w:b w:val="0"/>
-                <w:color w:val="000000"/>
-                <w:sz w:val="19"/>
-              </w:rPr>
-              <w:t>Adapter plus persistence</w:t>
+            <w:r>
+              <w:t>Persistence versus Chronos-2 benchmark</w:t>
             </w:r>
           </w:p>
         </w:tc>
@@ -11336,18 +10848,8 @@
             <w:shd w:fill="F5F8FC"/>
           </w:tcPr>
           <w:p>
-            <w:pPr>
-              <w:spacing w:after="0" w:line="252" w:lineRule="auto"/>
-              <w:jc w:val="left"/>
-            </w:pPr>
-            <w:r>
-              <w:rPr>
-                <w:rFonts w:ascii="Aptos" w:hAnsi="Aptos"/>
-                <w:b w:val="0"/>
-                <w:color w:val="000000"/>
-                <w:sz w:val="19"/>
-              </w:rPr>
-              <w:t>24-step forecasts and saved aggregate metrics on the held-out set</w:t>
+            <w:r>
+              <w:t>Paired accuracy, calibration, latency, memory, and failed-run metrics</w:t>
             </w:r>
           </w:p>
         </w:tc>
@@ -11365,17 +10867,7 @@
             </w:tcMar>
           </w:tcPr>
           <w:p>
-            <w:pPr>
-              <w:spacing w:after="0" w:line="252" w:lineRule="auto"/>
-              <w:jc w:val="center"/>
-            </w:pPr>
-            <w:r>
-              <w:rPr>
-                <w:rFonts w:ascii="Aptos" w:hAnsi="Aptos"/>
-                <w:b w:val="0"/>
-                <w:color w:val="000000"/>
-                <w:sz w:val="19"/>
-              </w:rPr>
+            <w:r>
               <w:t>3</w:t>
             </w:r>
           </w:p>
@@ -11392,18 +10884,8 @@
             </w:tcMar>
           </w:tcPr>
           <w:p>
-            <w:pPr>
-              <w:spacing w:after="0" w:line="252" w:lineRule="auto"/>
-              <w:jc w:val="left"/>
-            </w:pPr>
-            <w:r>
-              <w:rPr>
-                <w:rFonts w:ascii="Aptos" w:hAnsi="Aptos"/>
-                <w:b w:val="0"/>
-                <w:color w:val="000000"/>
-                <w:sz w:val="19"/>
-              </w:rPr>
-              <w:t>Chronos-2 smoke test</w:t>
+            <w:r>
+              <w:t>Context ablation</w:t>
             </w:r>
           </w:p>
         </w:tc>
@@ -11419,18 +10901,8 @@
             </w:tcMar>
           </w:tcPr>
           <w:p>
-            <w:pPr>
-              <w:spacing w:after="0" w:line="252" w:lineRule="auto"/>
-              <w:jc w:val="left"/>
-            </w:pPr>
-            <w:r>
-              <w:rPr>
-                <w:rFonts w:ascii="Aptos" w:hAnsi="Aptos"/>
-                <w:b w:val="0"/>
-                <w:color w:val="000000"/>
-                <w:sz w:val="19"/>
-              </w:rPr>
-              <w:t>Valid quantiles plus latency memory and failure-rate record</w:t>
+            <w:r>
+              <w:t>CGM-only, insulin, and nutrition comparisons on matched events</w:t>
             </w:r>
           </w:p>
         </w:tc>
@@ -11449,17 +10921,7 @@
             <w:shd w:fill="F5F8FC"/>
           </w:tcPr>
           <w:p>
-            <w:pPr>
-              <w:spacing w:after="0" w:line="252" w:lineRule="auto"/>
-              <w:jc w:val="center"/>
-            </w:pPr>
-            <w:r>
-              <w:rPr>
-                <w:rFonts w:ascii="Aptos" w:hAnsi="Aptos"/>
-                <w:b w:val="0"/>
-                <w:color w:val="000000"/>
-                <w:sz w:val="19"/>
-              </w:rPr>
+            <w:r>
               <w:t>4</w:t>
             </w:r>
           </w:p>
@@ -11477,18 +10939,8 @@
             <w:shd w:fill="F5F8FC"/>
           </w:tcPr>
           <w:p>
-            <w:pPr>
-              <w:spacing w:after="0" w:line="252" w:lineRule="auto"/>
-              <w:jc w:val="left"/>
-            </w:pPr>
-            <w:r>
-              <w:rPr>
-                <w:rFonts w:ascii="Aptos" w:hAnsi="Aptos"/>
-                <w:b w:val="0"/>
-                <w:color w:val="000000"/>
-                <w:sz w:val="19"/>
-              </w:rPr>
-              <w:t>Model comparison</w:t>
+            <w:r>
+              <w:t>Meal and nutrition capture</w:t>
             </w:r>
           </w:p>
         </w:tc>
@@ -11505,18 +10957,8 @@
             <w:shd w:fill="F5F8FC"/>
           </w:tcPr>
           <w:p>
-            <w:pPr>
-              <w:spacing w:after="0" w:line="252" w:lineRule="auto"/>
-              <w:jc w:val="left"/>
-            </w:pPr>
-            <w:r>
-              <w:rPr>
-                <w:rFonts w:ascii="Aptos" w:hAnsi="Aptos"/>
-                <w:b w:val="0"/>
-                <w:color w:val="000000"/>
-                <w:sz w:val="19"/>
-              </w:rPr>
-              <w:t>Paired persistence versus Chronos-2 metrics on identical test events</w:t>
+            <w:r>
+              <w:t>Verified nutrition object with source provenance</w:t>
             </w:r>
           </w:p>
         </w:tc>
@@ -11534,17 +10976,7 @@
             </w:tcMar>
           </w:tcPr>
           <w:p>
-            <w:pPr>
-              <w:spacing w:after="0" w:line="252" w:lineRule="auto"/>
-              <w:jc w:val="center"/>
-            </w:pPr>
-            <w:r>
-              <w:rPr>
-                <w:rFonts w:ascii="Aptos" w:hAnsi="Aptos"/>
-                <w:b w:val="0"/>
-                <w:color w:val="000000"/>
-                <w:sz w:val="19"/>
-              </w:rPr>
+            <w:r>
               <w:t>5</w:t>
             </w:r>
           </w:p>
@@ -11561,18 +10993,8 @@
             </w:tcMar>
           </w:tcPr>
           <w:p>
-            <w:pPr>
-              <w:spacing w:after="0" w:line="252" w:lineRule="auto"/>
-              <w:jc w:val="left"/>
-            </w:pPr>
-            <w:r>
-              <w:rPr>
-                <w:rFonts w:ascii="Aptos" w:hAnsi="Aptos"/>
-                <w:b w:val="0"/>
-                <w:color w:val="000000"/>
-                <w:sz w:val="19"/>
-              </w:rPr>
-              <w:t>App skeleton</w:t>
+            <w:r>
+              <w:t>Real-model application integration</w:t>
             </w:r>
           </w:p>
         </w:tc>
@@ -11588,18 +11010,8 @@
             </w:tcMar>
           </w:tcPr>
           <w:p>
-            <w:pPr>
-              <w:spacing w:after="0" w:line="252" w:lineRule="auto"/>
-              <w:jc w:val="left"/>
-            </w:pPr>
-            <w:r>
-              <w:rPr>
-                <w:rFonts w:ascii="Aptos" w:hAnsi="Aptos"/>
-                <w:b w:val="0"/>
-                <w:color w:val="000000"/>
-                <w:sz w:val="19"/>
-              </w:rPr>
-              <w:t>Browser request reaches FastAPI and displays a dummy forecast</w:t>
+            <w:r>
+              <w:t>Meal to context to forecast to visualization demonstration</w:t>
             </w:r>
           </w:p>
         </w:tc>
@@ -11618,17 +11030,7 @@
             <w:shd w:fill="F5F8FC"/>
           </w:tcPr>
           <w:p>
-            <w:pPr>
-              <w:spacing w:after="0" w:line="252" w:lineRule="auto"/>
-              <w:jc w:val="center"/>
-            </w:pPr>
-            <w:r>
-              <w:rPr>
-                <w:rFonts w:ascii="Aptos" w:hAnsi="Aptos"/>
-                <w:b w:val="0"/>
-                <w:color w:val="000000"/>
-                <w:sz w:val="19"/>
-              </w:rPr>
+            <w:r>
               <w:t>6</w:t>
             </w:r>
           </w:p>
@@ -11646,18 +11048,8 @@
             <w:shd w:fill="F5F8FC"/>
           </w:tcPr>
           <w:p>
-            <w:pPr>
-              <w:spacing w:after="0" w:line="252" w:lineRule="auto"/>
-              <w:jc w:val="left"/>
-            </w:pPr>
-            <w:r>
-              <w:rPr>
-                <w:rFonts w:ascii="Aptos" w:hAnsi="Aptos"/>
-                <w:b w:val="0"/>
-                <w:color w:val="000000"/>
-                <w:sz w:val="19"/>
-              </w:rPr>
-              <w:t>Simulator evidence</w:t>
+            <w:r>
+              <w:t>Persistence and similar-meal retrieval</w:t>
             </w:r>
           </w:p>
         </w:tc>
@@ -11674,18 +11066,8 @@
             <w:shd w:fill="F5F8FC"/>
           </w:tcPr>
           <w:p>
-            <w:pPr>
-              <w:spacing w:after="0" w:line="252" w:lineRule="auto"/>
-              <w:jc w:val="left"/>
-            </w:pPr>
-            <w:r>
-              <w:rPr>
-                <w:rFonts w:ascii="Aptos" w:hAnsi="Aptos"/>
-                <w:b w:val="0"/>
-                <w:color w:val="000000"/>
-                <w:sz w:val="19"/>
-              </w:rPr>
-              <w:t>One reproducible py-mgipsim run documented</w:t>
+            <w:r>
+              <w:t>Owner-isolated saved forecasts and historical meal evidence</w:t>
             </w:r>
           </w:p>
         </w:tc>
@@ -11711,7 +11093,7 @@
         <w:pStyle w:val="ListBullet"/>
       </w:pPr>
       <w:r>
-        <w:t>Approve T1D-UOM V1.0.4 as the primary rich-context retrospective dataset, with AZT1D or HUPA-UCM reserved for external shared-feature validation.</w:t>
+        <w:t>Confirm the primary evaluation metrics and whether uncertainty calibration is required for Milestone 2.</w:t>
       </w:r>
     </w:p>
     <w:p>
@@ -11719,7 +11101,7 @@
         <w:pStyle w:val="ListBullet"/>
       </w:pPr>
       <w:r>
-        <w:t>Confirm that Milestone 1 closes when Chronos-2 runs end to end through the common adapter and the minimum app and simulation feasibility checks are complete.</w:t>
+        <w:t>Confirm whether TimesFM should remain optional while the end-to-end meal-to-forecast workflow is completed.</w:t>
       </w:r>
     </w:p>
     <w:p>
@@ -11727,7 +11109,7 @@
         <w:pStyle w:val="ListBullet"/>
       </w:pPr>
       <w:r>
-        <w:t>Confirm the required model scope as persistence, Chronos-2, and one TimesFM version, while keeping CGMformer exploratory.</w:t>
+        <w:t>Confirm whether the next demonstration should prioritize the nutrition-to-forecast flow or broader model comparison.</w:t>
       </w:r>
     </w:p>
     <w:p>
@@ -11735,7 +11117,7 @@
         <w:pStyle w:val="ListBullet"/>
       </w:pPr>
       <w:r>
-        <w:t>Confirm whether low-volume participants should remain in aggregate model evaluation or be excluded only from personalization analyses under a declared minimum-event threshold.</w:t>
+        <w:t>Confirm when shared-feature external validation with AZT1D or HUPA-UCM should begin.</w:t>
       </w:r>
     </w:p>
     <w:p>

</xml_diff>